<commit_message>
docs: align frequency analysis with confirmed Epoch4 checkpoint
</commit_message>
<xml_diff>
--- a/论文修改/专项材料/第2条_替换章节_标红.docx
+++ b/论文修改/专项材料/第2条_替换章节_标红.docx
@@ -31,7 +31,7 @@
           <w:color w:val="FF0000"/>
           <w:sz w:val="21"/>
         </w:rPr>
-        <w:t>给定平滑尺度σ，取奇数核长K=2⌈2σ⌉+1，令M=(K−1)/2。以零为中心的离散坐标n取−M至M，归一化一维高斯核如式(1)所示；其系数和为1，“零中心”不表示核系数的均值为零。以一维核的外积构造三维核</w:t>
+        <w:t>本方法慢、快流分解及低频路径平滑均采用固定奇数核长K=5，平滑尺度σ分别为1.8和0.8；令M=(K−1)/2。以零为中心的离散坐标n取−M至M，归一化一维高斯核如式(1)所示；其系数和为1，“零中心”不表示核系数的均值为零。以一维核的外积构造三维核</w:t>
       </w:r>
       <w:r>
         <w:rPr>
@@ -1710,7 +1710,7 @@
           <w:color w:val="FF0000"/>
           <w:sz w:val="21"/>
         </w:rPr>
-        <w:t>本方法慢流σ=1.8、K=9，快流σ=0.8、K=5。定义幅值降至50%的频率满足|H(f)|=0.5，功率降至50%的频率满足|H(f)|²=0.5，分别对应约−6.02 dB与−3.01 dB。由实际有限长离散核计算，慢流的两个频率分别为0.799 Hz和0.571 Hz，快流分别为3.520 Hz和2.493 Hz。因此0.5 Hz不作为这两组参数的共同截止频率。</w:t>
+        <w:t>本方法慢流σ=1.8、K=5，快流σ=0.8、K=5。定义幅值降至50%的频率满足|H(f)|=0.5，功率降至50%的频率满足|H(f)|²=0.5，分别对应约−6.02 dB与−3.01 dB。由实际有限长离散核计算，慢流的两个频率分别为1.048 Hz和0.765 Hz，快流分别为3.520 Hz和2.493 Hz。因此0.5 Hz不作为这两组参数的共同截止频率。</w:t>
       </w:r>
     </w:p>
     <w:p>
@@ -1725,7 +1725,7 @@
           <w:color w:val="FF0000"/>
           <w:sz w:val="21"/>
         </w:rPr>
-        <w:t>未截断解析高斯的半高全宽为2√(2ln2)σ，慢流与快流分别约为4.239和1.884个特征采样点。按各分支采样间隔换算，分别约为565 ms和126 ms。该宽度用于解释尺度参数的时间量纲；有限截断、离散归一化后的截止特性应以式(5)计算，半高全宽不能直接替代截止频率。</w:t>
+        <w:t>未截断解析高斯的半高全宽为2√(2ln2)σ，慢流与快流分别约为4.239和1.884个特征采样点。按各分支采样间隔换算，分别约为565 ms和126 ms。该宽度用于解释尺度参数的时间量纲；有限截断、离散归一化后的截止特性应以式(5)计算，半高全宽不能直接替代截止频率，也不表示5点有限离散核的实测半高全宽。</w:t>
       </w:r>
     </w:p>
     <w:p>
@@ -1977,7 +1977,7 @@
           <w:color w:val="FF0000"/>
           <w:sz w:val="21"/>
         </w:rPr>
-        <w:t>离散响应及算子数值核验如图2所示。核验采用空间恒定的正弦输入，频率覆盖两条流的主要分析区间；每个序列含128个特征采样点，使用单精度浮点运算。对连续1、2、3次纯滤波分别剔除时空边界影响后拟合正弦幅值，在每条流12个频率点、共72组幅值比较中，计算曲线与滤波输出的最大绝对幅值误差为1.26×10⁻⁶。该核验检验有限离散核及其纯串联计算的一致性，不测量训练后完整网络的频率增益。</w:t>
+        <w:t>离散响应及算子数值核验如图2所示。核验直接使用原实验Epoch4检查点保存的固定核系数，采用空间恒定的正弦输入，频率覆盖两条流的主要分析区间；每个序列含128个特征采样点，使用单精度浮点运算。对连续1、2、3次纯滤波分别剔除时空边界影响后拟合正弦幅值，在每条流12个频率点、共72组幅值比较中，计算曲线与滤波输出的最大绝对幅值误差为4.99×10⁻⁷。该核验检验有限离散核及其纯串联计算的一致性，不测量训练后完整网络的频率增益。</w:t>
       </w:r>
     </w:p>
     <w:p>
@@ -2033,7 +2033,7 @@
           <w:color w:val="FF0000"/>
           <w:sz w:val="21"/>
         </w:rPr>
-        <w:t>图2　按稿件参数计算的高斯核离散幅频响应与纯滤波串联参考</w:t>
+        <w:t>图2　按原实验核参数计算的高斯核离散幅频响应与纯滤波串联参考</w:t>
       </w:r>
     </w:p>
     <w:p>

</xml_diff>